<commit_message>
fecth : Hoàn thành bìa tập thực hành tuần 04
</commit_message>
<xml_diff>
--- a/21095551_Mailuuhuuvinh_Day3/Mailuuhuuvinh_21095551.docx
+++ b/21095551_Mailuuhuuvinh_Day3/Mailuuhuuvinh_21095551.docx
@@ -95,94 +95,60 @@
         <w:t>bookstore-online-gio1</w:t>
       </w:r>
     </w:p>
-    <w:tbl>
-      <w:tblPr>
-        <w:tblStyle w:val="TableGrid"/>
-        <w:tblW w:w="0" w:type="auto"/>
-        <w:tblLook w:val="04A0" w:firstRow="1" w:lastRow="0" w:firstColumn="1" w:lastColumn="0" w:noHBand="0" w:noVBand="1"/>
-      </w:tblPr>
-      <w:tblGrid>
-        <w:gridCol w:w="9350"/>
-      </w:tblGrid>
-      <w:tr>
-        <w:tc>
-          <w:tcPr>
-            <w:tcW w:w="9350" w:type="dxa"/>
-          </w:tcPr>
-          <w:p>
-            <w:pPr>
-              <w:rPr>
-                <w:color w:val="FF0000"/>
-                <w:sz w:val="32"/>
-                <w:szCs w:val="32"/>
-                <w:lang w:val="vi-VN"/>
-              </w:rPr>
-            </w:pPr>
-            <w:r>
-              <w:rPr>
-                <w:noProof/>
-                <w:color w:val="FF0000"/>
-                <w:sz w:val="32"/>
-                <w:szCs w:val="32"/>
-                <w:lang w:val="vi-VN"/>
-              </w:rPr>
-              <w:drawing>
-                <wp:inline distT="0" distB="0" distL="0" distR="0" wp14:anchorId="2AEC4DCA" wp14:editId="6362AB1A">
-                  <wp:extent cx="3837167" cy="5227320"/>
-                  <wp:effectExtent l="0" t="0" r="0" b="0"/>
-                  <wp:docPr id="1" name="Picture 1"/>
-                  <wp:cNvGraphicFramePr>
-                    <a:graphicFrameLocks xmlns:a="http://schemas.openxmlformats.org/drawingml/2006/main" noChangeAspect="1"/>
-                  </wp:cNvGraphicFramePr>
-                  <a:graphic xmlns:a="http://schemas.openxmlformats.org/drawingml/2006/main">
-                    <a:graphicData uri="http://schemas.openxmlformats.org/drawingml/2006/picture">
-                      <pic:pic xmlns:pic="http://schemas.openxmlformats.org/drawingml/2006/picture">
-                        <pic:nvPicPr>
-                          <pic:cNvPr id="1" name=""/>
-                          <pic:cNvPicPr/>
-                        </pic:nvPicPr>
-                        <pic:blipFill>
-                          <a:blip r:embed="rId5"/>
-                          <a:stretch>
-                            <a:fillRect/>
-                          </a:stretch>
-                        </pic:blipFill>
-                        <pic:spPr>
-                          <a:xfrm>
-                            <a:off x="0" y="0"/>
-                            <a:ext cx="3843796" cy="5236350"/>
-                          </a:xfrm>
-                          <a:prstGeom prst="rect">
-                            <a:avLst/>
-                          </a:prstGeom>
-                        </pic:spPr>
-                      </pic:pic>
-                    </a:graphicData>
-                  </a:graphic>
-                </wp:inline>
-              </w:drawing>
-            </w:r>
-          </w:p>
-        </w:tc>
-      </w:tr>
-      <w:tr>
-        <w:tc>
-          <w:tcPr>
-            <w:tcW w:w="9350" w:type="dxa"/>
-          </w:tcPr>
-          <w:p>
-            <w:pPr>
-              <w:rPr>
-                <w:color w:val="FF0000"/>
-                <w:sz w:val="32"/>
-                <w:szCs w:val="32"/>
-                <w:lang w:val="vi-VN"/>
-              </w:rPr>
-            </w:pPr>
-          </w:p>
-        </w:tc>
-      </w:tr>
-    </w:tbl>
+    <w:p>
+      <w:pPr>
+        <w:rPr>
+          <w:color w:val="FF0000"/>
+          <w:sz w:val="32"/>
+          <w:szCs w:val="32"/>
+          <w:lang w:val="vi-VN"/>
+        </w:rPr>
+      </w:pPr>
+      <w:r>
+        <w:rPr>
+          <w:noProof/>
+          <w:color w:val="FF0000"/>
+          <w:sz w:val="32"/>
+          <w:szCs w:val="32"/>
+          <w:lang w:val="vi-VN"/>
+        </w:rPr>
+        <w:drawing>
+          <wp:inline distT="0" distB="0" distL="0" distR="0" wp14:anchorId="33ECE8B4" wp14:editId="70158FAB">
+            <wp:extent cx="4267200" cy="5813147"/>
+            <wp:effectExtent l="0" t="0" r="0" b="0"/>
+            <wp:docPr id="1" name="Picture 1"/>
+            <wp:cNvGraphicFramePr>
+              <a:graphicFrameLocks xmlns:a="http://schemas.openxmlformats.org/drawingml/2006/main" noChangeAspect="1"/>
+            </wp:cNvGraphicFramePr>
+            <a:graphic xmlns:a="http://schemas.openxmlformats.org/drawingml/2006/main">
+              <a:graphicData uri="http://schemas.openxmlformats.org/drawingml/2006/picture">
+                <pic:pic xmlns:pic="http://schemas.openxmlformats.org/drawingml/2006/picture">
+                  <pic:nvPicPr>
+                    <pic:cNvPr id="1" name=""/>
+                    <pic:cNvPicPr/>
+                  </pic:nvPicPr>
+                  <pic:blipFill>
+                    <a:blip r:embed="rId5"/>
+                    <a:stretch>
+                      <a:fillRect/>
+                    </a:stretch>
+                  </pic:blipFill>
+                  <pic:spPr>
+                    <a:xfrm>
+                      <a:off x="0" y="0"/>
+                      <a:ext cx="4276100" cy="5825272"/>
+                    </a:xfrm>
+                    <a:prstGeom prst="rect">
+                      <a:avLst/>
+                    </a:prstGeom>
+                  </pic:spPr>
+                </pic:pic>
+              </a:graphicData>
+            </a:graphic>
+          </wp:inline>
+        </w:drawing>
+      </w:r>
+    </w:p>
     <w:p>
       <w:pPr>
         <w:rPr>
@@ -231,9 +197,9 @@
         </w:rPr>
         <w:lastRenderedPageBreak/>
         <w:drawing>
-          <wp:inline distT="0" distB="0" distL="0" distR="0" wp14:anchorId="62667A88" wp14:editId="7FDD0DFD">
-            <wp:extent cx="5838862" cy="8130540"/>
-            <wp:effectExtent l="0" t="0" r="9525" b="3810"/>
+          <wp:inline distT="0" distB="0" distL="0" distR="0" wp14:anchorId="62667A88" wp14:editId="5B08795E">
+            <wp:extent cx="4531000" cy="6309360"/>
+            <wp:effectExtent l="0" t="0" r="3175" b="0"/>
             <wp:docPr id="2" name="Picture 2"/>
             <wp:cNvGraphicFramePr>
               <a:graphicFrameLocks xmlns:a="http://schemas.openxmlformats.org/drawingml/2006/main" noChangeAspect="1"/>
@@ -254,7 +220,7 @@
                   <pic:spPr>
                     <a:xfrm>
                       <a:off x="0" y="0"/>
-                      <a:ext cx="5839858" cy="8131927"/>
+                      <a:ext cx="4538555" cy="6319881"/>
                     </a:xfrm>
                     <a:prstGeom prst="rect">
                       <a:avLst/>
@@ -283,7 +249,6 @@
           <w:szCs w:val="32"/>
           <w:lang w:val="vi-VN"/>
         </w:rPr>
-        <w:lastRenderedPageBreak/>
         <w:t>bookstore-online-gio3</w:t>
       </w:r>
     </w:p>
@@ -304,10 +269,11 @@
           <w:szCs w:val="32"/>
           <w:lang w:val="vi-VN"/>
         </w:rPr>
+        <w:lastRenderedPageBreak/>
         <w:drawing>
-          <wp:inline distT="0" distB="0" distL="0" distR="0" wp14:anchorId="66340AD4" wp14:editId="37586518">
-            <wp:extent cx="4086874" cy="6941820"/>
-            <wp:effectExtent l="0" t="0" r="8890" b="0"/>
+          <wp:inline distT="0" distB="0" distL="0" distR="0" wp14:anchorId="66340AD4" wp14:editId="4B72A017">
+            <wp:extent cx="3855720" cy="6549191"/>
+            <wp:effectExtent l="0" t="0" r="0" b="4445"/>
             <wp:docPr id="4" name="Picture 4"/>
             <wp:cNvGraphicFramePr>
               <a:graphicFrameLocks xmlns:a="http://schemas.openxmlformats.org/drawingml/2006/main" noChangeAspect="1"/>
@@ -328,7 +294,7 @@
                   <pic:spPr>
                     <a:xfrm>
                       <a:off x="0" y="0"/>
-                      <a:ext cx="4088882" cy="6945231"/>
+                      <a:ext cx="3859341" cy="6555341"/>
                     </a:xfrm>
                     <a:prstGeom prst="rect">
                       <a:avLst/>

</xml_diff>